<commit_message>
feat: automatizar geracao de propostas comerciais (Pools, Revest, Eco Stone)
</commit_message>
<xml_diff>
--- a/src/templates/Proposta_Cascata_Template.docx
+++ b/src/templates/Proposta_Cascata_Template.docx
@@ -5,22 +5,26 @@
     <w:p>
       <w:pPr>
         <w:pStyle w:val="Ttulo1"/>
-        <w:spacing w:after="300"/>
+        <w:spacing w:after="225"/>
         <w:jc w:val="center"/>
         <w:rPr>
           <w:color w:val="003366"/>
+          <w:sz w:val="40"/>
+          <w:szCs w:val="40"/>
         </w:rPr>
       </w:pPr>
       <w:r>
         <w:rPr>
           <w:noProof/>
           <w:color w:val="003366"/>
+          <w:sz w:val="40"/>
+          <w:szCs w:val="40"/>
         </w:rPr>
         <w:drawing>
-          <wp:inline distT="0" distB="0" distL="0" distR="0" wp14:anchorId="5B57A59B" wp14:editId="7042E343">
-            <wp:extent cx="6105525" cy="6105525"/>
+          <wp:inline distT="0" distB="0" distL="0" distR="0" wp14:anchorId="0A4C4FF2" wp14:editId="28DF4F52">
+            <wp:extent cx="6334125" cy="6334125"/>
             <wp:effectExtent l="0" t="0" r="9525" b="9525"/>
-            <wp:docPr id="1745079043" name="Imagem 1"/>
+            <wp:docPr id="1629118205" name="Imagem 1"/>
             <wp:cNvGraphicFramePr>
               <a:graphicFrameLocks xmlns:a="http://schemas.openxmlformats.org/drawingml/2006/main" noChangeAspect="1"/>
             </wp:cNvGraphicFramePr>
@@ -28,7 +32,7 @@
               <a:graphicData uri="http://schemas.openxmlformats.org/drawingml/2006/picture">
                 <pic:pic xmlns:pic="http://schemas.openxmlformats.org/drawingml/2006/picture">
                   <pic:nvPicPr>
-                    <pic:cNvPr id="1745079043" name="Imagem 1745079043"/>
+                    <pic:cNvPr id="1629118205" name="Imagem 1629118205"/>
                     <pic:cNvPicPr/>
                   </pic:nvPicPr>
                   <pic:blipFill>
@@ -46,7 +50,7 @@
                   <pic:spPr>
                     <a:xfrm>
                       <a:off x="0" y="0"/>
-                      <a:ext cx="6105525" cy="6105525"/>
+                      <a:ext cx="6334125" cy="6334125"/>
                     </a:xfrm>
                     <a:prstGeom prst="rect">
                       <a:avLst/>
@@ -58,12 +62,6 @@
           </wp:inline>
         </w:drawing>
       </w:r>
-      <w:r>
-        <w:rPr>
-          <w:color w:val="003366"/>
-        </w:rPr>
-        <w:t>PROPOSTA COMERCIAL: EXECUÇÃO DE CASCATA</w:t>
-      </w:r>
     </w:p>
     <w:p>
       <w:pPr>
@@ -74,18 +72,12 @@
           <w:right w:val="nil"/>
           <w:between w:val="nil"/>
         </w:pBdr>
-        <w:spacing w:line="300" w:lineRule="auto"/>
-      </w:pPr>
-      <w:r>
+        <w:spacing w:line="275" w:lineRule="auto"/>
         <w:rPr>
           <w:b/>
           <w:bCs/>
         </w:rPr>
-        <w:t>Empresa:</w:t>
-      </w:r>
-      <w:r>
-        <w:t xml:space="preserve"> ECO STONE BRASIL</w:t>
-      </w:r>
+      </w:pPr>
     </w:p>
     <w:p>
       <w:pPr>
@@ -96,18 +88,12 @@
           <w:right w:val="nil"/>
           <w:between w:val="nil"/>
         </w:pBdr>
-        <w:spacing w:line="300" w:lineRule="auto"/>
-      </w:pPr>
-      <w:r>
+        <w:spacing w:line="275" w:lineRule="auto"/>
         <w:rPr>
           <w:b/>
           <w:bCs/>
         </w:rPr>
-        <w:t>Cliente:</w:t>
-      </w:r>
-      <w:r>
-        <w:t xml:space="preserve"> {clienteNome}</w:t>
-      </w:r>
+      </w:pPr>
     </w:p>
     <w:p>
       <w:pPr>
@@ -118,17 +104,14 @@
           <w:right w:val="nil"/>
           <w:between w:val="nil"/>
         </w:pBdr>
-        <w:spacing w:line="300" w:lineRule="auto"/>
+        <w:spacing w:line="275" w:lineRule="auto"/>
       </w:pPr>
       <w:r>
         <w:rPr>
           <w:b/>
           <w:bCs/>
         </w:rPr>
-        <w:t>Local da Obra:</w:t>
-      </w:r>
-      <w:r>
-        <w:t xml:space="preserve"> {clienteEndereco}</w:t>
+        <w:t>Empresa: ECO STONE BRASIL</w:t>
       </w:r>
     </w:p>
     <w:p>
@@ -140,17 +123,14 @@
           <w:right w:val="nil"/>
           <w:between w:val="nil"/>
         </w:pBdr>
-        <w:spacing w:line="300" w:lineRule="auto"/>
+        <w:spacing w:line="275" w:lineRule="auto"/>
       </w:pPr>
       <w:r>
         <w:rPr>
           <w:b/>
           <w:bCs/>
         </w:rPr>
-        <w:t>Data:</w:t>
-      </w:r>
-      <w:r>
-        <w:t xml:space="preserve"> {dataProposta}</w:t>
+        <w:t>Cliente: {clienteNome}</w:t>
       </w:r>
     </w:p>
     <w:p>
@@ -162,33 +142,14 @@
           <w:right w:val="nil"/>
           <w:between w:val="nil"/>
         </w:pBdr>
-        <w:spacing w:after="375" w:line="300" w:lineRule="auto"/>
+        <w:spacing w:line="275" w:lineRule="auto"/>
       </w:pPr>
       <w:r>
         <w:rPr>
           <w:b/>
           <w:bCs/>
         </w:rPr>
-        <w:t>Proposta Nº:</w:t>
-      </w:r>
-      <w:r>
-        <w:t xml:space="preserve"> {propostaNumero}</w:t>
-      </w:r>
-    </w:p>
-    <w:p>
-      <w:pPr>
-        <w:pStyle w:val="Ttulo2"/>
-        <w:spacing w:before="0" w:after="150"/>
-        <w:rPr>
-          <w:color w:val="003366"/>
-        </w:rPr>
-      </w:pPr>
-      <w:r>
-        <w:rPr>
-          <w:color w:val="003366"/>
-        </w:rPr>
-        <w:lastRenderedPageBreak/>
-        <w:t>1. Objetivo e Entendimento do Projeto</w:t>
+        <w:t>Local da Obra: {clienteEndereco}</w:t>
       </w:r>
     </w:p>
     <w:p>
@@ -200,43 +161,85 @@
           <w:right w:val="nil"/>
           <w:between w:val="nil"/>
         </w:pBdr>
-        <w:spacing w:after="375" w:line="300" w:lineRule="auto"/>
-      </w:pPr>
-      <w:r>
-        <w:t xml:space="preserve">A </w:t>
-      </w:r>
+        <w:spacing w:line="275" w:lineRule="auto"/>
+      </w:pPr>
       <w:r>
         <w:rPr>
           <w:b/>
           <w:bCs/>
         </w:rPr>
-        <w:t>ECO STONE BRASIL</w:t>
+        <w:t>Data: {dataProposta}</w:t>
       </w:r>
-      <w:r>
-        <w:t xml:space="preserve"> apresenta esta proposta técnico-comercial para a implantação de uma cascata decorativa e funcional integrada à piscina já existente em sua residência. Nosso foco é entregar uma estética impecável — que valorize a área de lazer e crie uma atmosfera de relaxamento com o som da água — </w:t>
-      </w:r>
+    </w:p>
+    <w:p>
+      <w:pPr>
+        <w:pBdr>
+          <w:top w:val="nil"/>
+          <w:left w:val="nil"/>
+          <w:bottom w:val="nil"/>
+          <w:right w:val="nil"/>
+          <w:between w:val="nil"/>
+        </w:pBdr>
+        <w:spacing w:after="300" w:line="275" w:lineRule="auto"/>
+      </w:pPr>
       <w:r>
         <w:rPr>
           <w:b/>
           <w:bCs/>
         </w:rPr>
-        <w:t>sem comprometer a impermeabilização ou a integridade estrutural da piscina atual</w:t>
-      </w:r>
-      <w:r>
-        <w:t>.</w:t>
+        <w:t>Proposta Nº: {propostaNumero}</w:t>
       </w:r>
     </w:p>
     <w:p>
       <w:pPr>
         <w:pStyle w:val="Ttulo2"/>
-        <w:spacing w:before="0" w:after="150"/>
+        <w:spacing w:before="0" w:after="120"/>
         <w:rPr>
           <w:color w:val="003366"/>
+          <w:sz w:val="28"/>
+          <w:szCs w:val="28"/>
         </w:rPr>
       </w:pPr>
       <w:r>
         <w:rPr>
           <w:color w:val="003366"/>
+          <w:sz w:val="28"/>
+          <w:szCs w:val="28"/>
+        </w:rPr>
+        <w:lastRenderedPageBreak/>
+        <w:t>1. Objetivo e Entendimento do Projeto</w:t>
+      </w:r>
+    </w:p>
+    <w:p>
+      <w:pPr>
+        <w:pBdr>
+          <w:top w:val="nil"/>
+          <w:left w:val="nil"/>
+          <w:bottom w:val="nil"/>
+          <w:right w:val="nil"/>
+          <w:between w:val="nil"/>
+        </w:pBdr>
+        <w:spacing w:after="300" w:line="275" w:lineRule="auto"/>
+      </w:pPr>
+      <w:r>
+        <w:t xml:space="preserve">A ECO STONE BRASIL apresenta esta proposta técnico-comercial para a implantação de uma cascata decorativa e de pedras esculpidas integradas à piscina já existente em sua residência. Nosso foco é entregar uma estética impecável — que valorize a área de lazer e crie uma atmosfera de relaxamento com o som da água — sem comprometer a impermeabilização ou a integridade estrutural da piscina atual.</w:t>
+      </w:r>
+    </w:p>
+    <w:p>
+      <w:pPr>
+        <w:pStyle w:val="Ttulo2"/>
+        <w:spacing w:before="0" w:after="120"/>
+        <w:rPr>
+          <w:color w:val="003366"/>
+          <w:sz w:val="28"/>
+          <w:szCs w:val="28"/>
+        </w:rPr>
+      </w:pPr>
+      <w:r>
+        <w:rPr>
+          <w:color w:val="003366"/>
+          <w:sz w:val="28"/>
+          <w:szCs w:val="28"/>
         </w:rPr>
         <w:t>2. Diferenciais ECO STONE BRASIL</w:t>
       </w:r>
@@ -254,17 +257,14 @@
           <w:right w:val="nil"/>
           <w:between w:val="nil"/>
         </w:pBdr>
-        <w:spacing w:line="300" w:lineRule="auto"/>
+        <w:spacing w:line="275" w:lineRule="auto"/>
       </w:pPr>
       <w:r>
         <w:rPr>
           <w:b/>
           <w:bCs/>
         </w:rPr>
-        <w:t>Intervenção Limpa e Segura:</w:t>
-      </w:r>
-      <w:r>
-        <w:t xml:space="preserve"> Metodologia de trabalho adaptada para estruturas já prontas, minimizando o impacto na rotina da casa e evitando quebras desnecessárias de revestimento.</w:t>
+        <w:t>Intervenção Limpa e Segura: Metodologia de trabalho adaptada para estruturas já prontas, minimizando o impacto na rotina da casa e evitando quebras desnecessárias de revestimento.</w:t>
       </w:r>
     </w:p>
     <w:p>
@@ -280,17 +280,14 @@
           <w:right w:val="nil"/>
           <w:between w:val="nil"/>
         </w:pBdr>
-        <w:spacing w:line="300" w:lineRule="auto"/>
+        <w:spacing w:line="275" w:lineRule="auto"/>
       </w:pPr>
       <w:r>
         <w:rPr>
           <w:b/>
           <w:bCs/>
         </w:rPr>
-        <w:t>Estética Exclusiva:</w:t>
-      </w:r>
-      <w:r>
-        <w:t xml:space="preserve"> Modelagem artística feita no local, garantindo um design único e perfeitamente integrado ao paisagismo.</w:t>
+        <w:t>Estética Exclusiva: Modelagem artística artesanal feita no local, garantindo um design único e perfeitamente integrado ao paisagismo.</w:t>
       </w:r>
     </w:p>
     <w:p>
@@ -306,30 +303,31 @@
           <w:right w:val="nil"/>
           <w:between w:val="nil"/>
         </w:pBdr>
-        <w:spacing w:after="120" w:line="300" w:lineRule="auto"/>
+        <w:spacing w:after="90" w:line="275" w:lineRule="auto"/>
       </w:pPr>
       <w:r>
         <w:rPr>
           <w:b/>
           <w:bCs/>
         </w:rPr>
-        <w:t>Eficiência Hidráulica:</w:t>
-      </w:r>
-      <w:r>
-        <w:t xml:space="preserve"> Dimensionamento ideal do fluxo de água, garantindo uma queda bem desenhada, sem respingos excessivos para fora da área da piscina e com baixo consumo energético.</w:t>
+        <w:t>Eficiência Hidráulica: Dimensionamento ideal do fluxo de água, garantindo uma queda bem desenhada, sem respingos excessivos para fora da área da piscina e com baixo consumo energético.</w:t>
       </w:r>
     </w:p>
     <w:p>
       <w:pPr>
         <w:pStyle w:val="Ttulo2"/>
-        <w:spacing w:before="375"/>
+        <w:spacing w:before="300" w:after="180"/>
         <w:rPr>
           <w:color w:val="003366"/>
+          <w:sz w:val="28"/>
+          <w:szCs w:val="28"/>
         </w:rPr>
       </w:pPr>
       <w:r>
         <w:rPr>
           <w:color w:val="003366"/>
+          <w:sz w:val="28"/>
+          <w:szCs w:val="28"/>
         </w:rPr>
         <w:t>3. Escopo Técnico e Etapas de Execução</w:t>
       </w:r>
@@ -337,14 +335,18 @@
     <w:p>
       <w:pPr>
         <w:pStyle w:val="Ttulo3"/>
-        <w:spacing w:before="0" w:after="75"/>
+        <w:spacing w:before="0" w:after="60"/>
         <w:rPr>
           <w:color w:val="333333"/>
+          <w:sz w:val="24"/>
+          <w:szCs w:val="24"/>
         </w:rPr>
       </w:pPr>
       <w:r>
         <w:rPr>
           <w:color w:val="333333"/>
+          <w:sz w:val="24"/>
+          <w:szCs w:val="24"/>
         </w:rPr>
         <w:t>Fase 1: Vistoria Técnica e Proteção da Área</w:t>
       </w:r>
@@ -362,7 +364,7 @@
           <w:right w:val="nil"/>
           <w:between w:val="nil"/>
         </w:pBdr>
-        <w:spacing w:line="300" w:lineRule="auto"/>
+        <w:spacing w:line="275" w:lineRule="auto"/>
       </w:pPr>
       <w:r>
         <w:t>Proteção do espelho d'água, bordas e revestimentos existentes no entorno do local de instalação.</w:t>
@@ -381,7 +383,7 @@
           <w:right w:val="nil"/>
           <w:between w:val="nil"/>
         </w:pBdr>
-        <w:spacing w:line="300" w:lineRule="auto"/>
+        <w:spacing w:line="275" w:lineRule="auto"/>
       </w:pPr>
       <w:r>
         <w:t>Mapeamento estrutural da borda/alvenaria para ancoragem segura da nova estrutura.</w:t>
@@ -390,14 +392,18 @@
     <w:p>
       <w:pPr>
         <w:pStyle w:val="Ttulo3"/>
-        <w:spacing w:before="225" w:after="75"/>
+        <w:spacing w:before="180" w:after="60"/>
         <w:rPr>
           <w:color w:val="333333"/>
+          <w:sz w:val="24"/>
+          <w:szCs w:val="24"/>
         </w:rPr>
       </w:pPr>
       <w:r>
         <w:rPr>
           <w:color w:val="333333"/>
+          <w:sz w:val="24"/>
+          <w:szCs w:val="24"/>
         </w:rPr>
         <w:t>Fase 2: Adequação Hidráulica e Eletromecânica</w:t>
       </w:r>
@@ -415,17 +421,10 @@
           <w:right w:val="nil"/>
           <w:between w:val="nil"/>
         </w:pBdr>
-        <w:spacing w:line="300" w:lineRule="auto"/>
+        <w:spacing w:line="275" w:lineRule="auto"/>
       </w:pPr>
       <w:r>
-        <w:rPr>
-          <w:b/>
-          <w:bCs/>
-        </w:rPr>
-        <w:t>Opção A (Integração):</w:t>
-      </w:r>
-      <w:r>
-        <w:t xml:space="preserve"> Conexão à casa de máquinas existente através de derivação na tubulação de retorno, com instalação de registro independente para controle de fluxo.</w:t>
+        <w:t>Conexão à casa de máquinas existente através de derivação na tubulação de retorno, com instalação de registro independente para controle de fluxo.</w:t>
       </w:r>
     </w:p>
     <w:p>
@@ -441,30 +440,31 @@
           <w:right w:val="nil"/>
           <w:between w:val="nil"/>
         </w:pBdr>
-        <w:spacing w:line="300" w:lineRule="auto"/>
+        <w:spacing w:line="275" w:lineRule="auto"/>
       </w:pPr>
       <w:r>
         <w:rPr>
-          <w:b/>
-          <w:bCs/>
+          <w:i/>
+          <w:iCs/>
         </w:rPr>
-        <w:t>Opção B (Sistema Independente - Recomendado):</w:t>
-      </w:r>
-      <w:r>
-        <w:t xml:space="preserve"> Instalação de motobomba exclusiva, com captação e acionamento independentes da filtragem da piscina.</w:t>
+        <w:t>(Recomendado) Instalação de motobomba exclusiva, com captação e acionamento independentes da filtragem da piscina.</w:t>
       </w:r>
     </w:p>
     <w:p>
       <w:pPr>
         <w:pStyle w:val="Ttulo3"/>
-        <w:spacing w:before="225" w:after="75"/>
+        <w:spacing w:before="180" w:after="60"/>
         <w:rPr>
           <w:color w:val="333333"/>
+          <w:sz w:val="24"/>
+          <w:szCs w:val="24"/>
         </w:rPr>
       </w:pPr>
       <w:r>
         <w:rPr>
           <w:color w:val="333333"/>
+          <w:sz w:val="24"/>
+          <w:szCs w:val="24"/>
         </w:rPr>
         <w:t>Fase 3: Estruturação e Impermeabilização</w:t>
       </w:r>
@@ -482,7 +482,7 @@
           <w:right w:val="nil"/>
           <w:between w:val="nil"/>
         </w:pBdr>
-        <w:spacing w:line="300" w:lineRule="auto"/>
+        <w:spacing w:line="275" w:lineRule="auto"/>
       </w:pPr>
       <w:r>
         <w:t>Armação da estrutura base utilizando ferragem ancorada na alvenaria externa.</w:t>
@@ -501,30 +501,31 @@
           <w:right w:val="nil"/>
           <w:between w:val="nil"/>
         </w:pBdr>
-        <w:spacing w:line="300" w:lineRule="auto"/>
+        <w:spacing w:line="275" w:lineRule="auto"/>
       </w:pPr>
       <w:r>
         <w:rPr>
           <w:b/>
           <w:bCs/>
         </w:rPr>
-        <w:t>Impermeabilização de alta performance</w:t>
-      </w:r>
-      <w:r>
-        <w:t xml:space="preserve"> em toda a calha de transbordo e área de contato, com garantia integral contra infiltrações.</w:t>
+        <w:t>Impermeabilização de alta performance em toda a calha de transbordo e área de contato, com garantia integral contra infiltrações.</w:t>
       </w:r>
     </w:p>
     <w:p>
       <w:pPr>
         <w:pStyle w:val="Ttulo3"/>
-        <w:spacing w:before="225" w:after="75"/>
+        <w:spacing w:before="180" w:after="60"/>
         <w:rPr>
           <w:color w:val="333333"/>
+          <w:sz w:val="24"/>
+          <w:szCs w:val="24"/>
         </w:rPr>
       </w:pPr>
       <w:r>
         <w:rPr>
           <w:color w:val="333333"/>
+          <w:sz w:val="24"/>
+          <w:szCs w:val="24"/>
         </w:rPr>
         <w:t>Fase 4: Modelagem e Acabamento (Padrão ECO STONE)</w:t>
       </w:r>
@@ -542,20 +543,14 @@
           <w:right w:val="nil"/>
           <w:between w:val="nil"/>
         </w:pBdr>
-        <w:spacing w:line="300" w:lineRule="auto"/>
-      </w:pPr>
-      <w:r>
-        <w:t xml:space="preserve">Escultura e modelagem da rocha artificial utilizando </w:t>
-      </w:r>
+        <w:spacing w:line="275" w:lineRule="auto"/>
+      </w:pPr>
       <w:r>
         <w:rPr>
           <w:b/>
           <w:bCs/>
         </w:rPr>
-        <w:t>material básico para cascata</w:t>
-      </w:r>
-      <w:r>
-        <w:t xml:space="preserve"> (concreto armado composto por areia, cimento e ferro).</w:t>
+        <w:t>Item 1 (Cascata): Escultura e modelagem de rocha artificial com dimensões de 4,00m x 1,50m e 1,60m de altura, totalizando 9 m².</w:t>
       </w:r>
     </w:p>
     <w:p>
@@ -571,10 +566,14 @@
           <w:right w:val="nil"/>
           <w:between w:val="nil"/>
         </w:pBdr>
-        <w:spacing w:line="300" w:lineRule="auto"/>
+        <w:spacing w:line="275" w:lineRule="auto"/>
       </w:pPr>
       <w:r>
-        <w:t>Instalação de lâmina/bico de transbordo oculto.</w:t>
+        <w:rPr>
+          <w:b/>
+          <w:bCs/>
+        </w:rPr>
+        <w:t>Itens 3 e 4 (Amontoado de Pedras): Escultura e modelagem de rochas decorativas com dimensões de 2,00m x 1,50m e 1,00m de altura, totalizando 6 m².</w:t>
       </w:r>
     </w:p>
     <w:p>
@@ -590,29 +589,70 @@
           <w:right w:val="nil"/>
           <w:between w:val="nil"/>
         </w:pBdr>
-        <w:spacing w:line="300" w:lineRule="auto"/>
-      </w:pPr>
-      <w:proofErr w:type="gramStart"/>
+        <w:spacing w:line="275" w:lineRule="auto"/>
+      </w:pPr>
       <w:r>
-        <w:lastRenderedPageBreak/>
-        <w:t>Acabamento final</w:t>
-      </w:r>
-      <w:proofErr w:type="gramEnd"/>
-      <w:r>
-        <w:t xml:space="preserve"> com textura e pintura artística (tinta especial) para conferir aspecto realista de rocha natural.</w:t>
+        <w:t>Estruturação executada utilizando concreto armado composto por areia, cimento e ferro (fornecidos pela ECO STONE BRASIL).</w:t>
       </w:r>
     </w:p>
     <w:p>
       <w:pPr>
+        <w:numPr>
+          <w:ilvl w:val="0"/>
+          <w:numId w:val="5"/>
+        </w:numPr>
+        <w:pBdr>
+          <w:top w:val="nil"/>
+          <w:left w:val="nil"/>
+          <w:bottom w:val="nil"/>
+          <w:right w:val="nil"/>
+          <w:between w:val="nil"/>
+        </w:pBdr>
+        <w:spacing w:line="275" w:lineRule="auto"/>
+      </w:pPr>
+      <w:r>
+        <w:t>Instalação de lâmina/bico de transbordo oculto.</w:t>
+      </w:r>
+    </w:p>
+    <w:p>
+      <w:pPr>
+        <w:numPr>
+          <w:ilvl w:val="0"/>
+          <w:numId w:val="5"/>
+        </w:numPr>
+        <w:pBdr>
+          <w:top w:val="nil"/>
+          <w:left w:val="nil"/>
+          <w:bottom w:val="nil"/>
+          <w:right w:val="nil"/>
+          <w:between w:val="nil"/>
+        </w:pBdr>
+        <w:spacing w:line="275" w:lineRule="auto"/>
+      </w:pPr>
+      <w:proofErr w:type="gramStart"/>
+      <w:r>
+        <w:t>Acabamento final com textura e pintura artística (tinta especial) para conferir aspecto </w:t>
+      </w:r>
+      <w:r>
+        <w:lastRenderedPageBreak/>
+        <w:t>realista de rocha natural.</w:t>
+      </w:r>
+    </w:p>
+    <w:p>
+      <w:pPr>
         <w:pStyle w:val="Ttulo3"/>
-        <w:spacing w:before="225" w:after="75"/>
+        <w:spacing w:before="180" w:after="60"/>
         <w:rPr>
           <w:color w:val="333333"/>
+          <w:sz w:val="24"/>
+          <w:szCs w:val="24"/>
         </w:rPr>
       </w:pPr>
       <w:r>
         <w:rPr>
           <w:color w:val="333333"/>
+          <w:sz w:val="24"/>
+          <w:szCs w:val="24"/>
         </w:rPr>
         <w:t>Fase 5: Testes, Limpeza e Entrega Técnica</w:t>
       </w:r>
@@ -630,42 +670,27 @@
           <w:right w:val="nil"/>
           <w:between w:val="nil"/>
         </w:pBdr>
-        <w:spacing w:line="300" w:lineRule="auto"/>
+        <w:spacing w:line="275" w:lineRule="auto"/>
       </w:pPr>
       <w:r>
-        <w:t>Limpeza pós-obra da área de lazer.</w:t>
+        <w:t>Limpeza pós-obra detalhada da área de lazer e testes hidráulicos de vazão para entrega oficial do sistema funcionando perfeitamente.</w:t>
       </w:r>
     </w:p>
     <w:p>
       <w:pPr>
-        <w:numPr>
-          <w:ilvl w:val="0"/>
-          <w:numId w:val="6"/>
-        </w:numPr>
-        <w:pBdr>
-          <w:top w:val="nil"/>
-          <w:left w:val="nil"/>
-          <w:bottom w:val="nil"/>
-          <w:right w:val="nil"/>
-          <w:between w:val="nil"/>
-        </w:pBdr>
-        <w:spacing w:line="300" w:lineRule="auto"/>
-      </w:pPr>
-      <w:r>
-        <w:t>Teste de vazão, regulagem do fluxo da lâmina d'água e entrega do sistema funcionando.</w:t>
-      </w:r>
-    </w:p>
-    <w:p>
-      <w:pPr>
         <w:pStyle w:val="Ttulo2"/>
-        <w:spacing w:before="375"/>
+        <w:spacing w:before="300" w:after="150"/>
         <w:rPr>
           <w:color w:val="003366"/>
+          <w:sz w:val="28"/>
+          <w:szCs w:val="28"/>
         </w:rPr>
       </w:pPr>
       <w:r>
         <w:rPr>
           <w:color w:val="003366"/>
+          <w:sz w:val="28"/>
+          <w:szCs w:val="28"/>
         </w:rPr>
         <w:t>4. Investimento</w:t>
       </w:r>
@@ -706,10 +731,10 @@
             </w:tcBorders>
             <w:shd w:val="clear" w:color="auto" w:fill="003366"/>
             <w:tcMar>
-              <w:top w:w="180" w:type="dxa"/>
-              <w:left w:w="180" w:type="dxa"/>
-              <w:bottom w:w="180" w:type="dxa"/>
-              <w:right w:w="180" w:type="dxa"/>
+              <w:top w:w="120" w:type="dxa"/>
+              <w:left w:w="150" w:type="dxa"/>
+              <w:bottom w:w="120" w:type="dxa"/>
+              <w:right w:w="150" w:type="dxa"/>
             </w:tcMar>
           </w:tcPr>
           <w:p>
@@ -721,14 +746,19 @@
                 <w:right w:val="nil"/>
                 <w:between w:val="nil"/>
               </w:pBdr>
-              <w:spacing w:before="180" w:after="180"/>
+              <w:spacing w:before="120" w:after="120"/>
+              <w:jc w:val="center"/>
               <w:rPr>
                 <w:color w:val="FFFFFF"/>
+                <w:sz w:val="20"/>
+                <w:szCs w:val="20"/>
               </w:rPr>
             </w:pPr>
             <w:r>
               <w:rPr>
                 <w:color w:val="FFFFFF"/>
+                <w:sz w:val="20"/>
+                <w:szCs w:val="20"/>
               </w:rPr>
               <w:t>Item</w:t>
             </w:r>
@@ -745,10 +775,10 @@
             </w:tcBorders>
             <w:shd w:val="clear" w:color="auto" w:fill="003366"/>
             <w:tcMar>
-              <w:top w:w="180" w:type="dxa"/>
-              <w:left w:w="180" w:type="dxa"/>
-              <w:bottom w:w="180" w:type="dxa"/>
-              <w:right w:w="180" w:type="dxa"/>
+              <w:top w:w="120" w:type="dxa"/>
+              <w:left w:w="150" w:type="dxa"/>
+              <w:bottom w:w="120" w:type="dxa"/>
+              <w:right w:w="150" w:type="dxa"/>
             </w:tcMar>
           </w:tcPr>
           <w:p>
@@ -760,14 +790,18 @@
                 <w:right w:val="nil"/>
                 <w:between w:val="nil"/>
               </w:pBdr>
-              <w:spacing w:before="180" w:after="180"/>
+              <w:spacing w:before="120" w:after="120"/>
               <w:rPr>
                 <w:color w:val="FFFFFF"/>
+                <w:sz w:val="20"/>
+                <w:szCs w:val="20"/>
               </w:rPr>
             </w:pPr>
             <w:r>
               <w:rPr>
                 <w:color w:val="FFFFFF"/>
+                <w:sz w:val="20"/>
+                <w:szCs w:val="20"/>
               </w:rPr>
               <w:t>Descrição</w:t>
             </w:r>
@@ -784,10 +818,10 @@
             </w:tcBorders>
             <w:shd w:val="clear" w:color="auto" w:fill="003366"/>
             <w:tcMar>
-              <w:top w:w="180" w:type="dxa"/>
-              <w:left w:w="180" w:type="dxa"/>
-              <w:bottom w:w="180" w:type="dxa"/>
-              <w:right w:w="180" w:type="dxa"/>
+              <w:top w:w="120" w:type="dxa"/>
+              <w:left w:w="150" w:type="dxa"/>
+              <w:bottom w:w="120" w:type="dxa"/>
+              <w:right w:w="150" w:type="dxa"/>
             </w:tcMar>
           </w:tcPr>
           <w:p>
@@ -799,15 +833,19 @@
                 <w:right w:val="nil"/>
                 <w:between w:val="nil"/>
               </w:pBdr>
-              <w:spacing w:before="180" w:after="180"/>
+              <w:spacing w:before="120" w:after="120"/>
               <w:jc w:val="right"/>
               <w:rPr>
                 <w:color w:val="FFFFFF"/>
+                <w:sz w:val="20"/>
+                <w:szCs w:val="20"/>
               </w:rPr>
             </w:pPr>
             <w:r>
               <w:rPr>
                 <w:color w:val="FFFFFF"/>
+                <w:sz w:val="20"/>
+                <w:szCs w:val="20"/>
               </w:rPr>
               <w:t>Valor (R$)</w:t>
             </w:r>
@@ -821,8 +859,16 @@
                 <w:right w:val="nil"/>
                 <w:between w:val="nil"/>
               </w:pBdr>
+              <w:rPr>
+                <w:sz w:val="20"/>
+                <w:szCs w:val="20"/>
+              </w:rPr>
             </w:pPr>
             <w:r>
+              <w:rPr>
+                <w:sz w:val="20"/>
+                <w:szCs w:val="20"/>
+              </w:rPr>
               <w:t xml:space="preserve"> </w:t>
             </w:r>
           </w:p>
@@ -839,6 +885,535 @@
               <w:right w:val="single" w:sz="6" w:space="0" w:color="CCCCCC"/>
             </w:tcBorders>
             <w:shd w:val="clear" w:color="auto" w:fill="F9F9F9"/>
+            <w:tcMar>
+              <w:top w:w="120" w:type="dxa"/>
+              <w:left w:w="150" w:type="dxa"/>
+              <w:bottom w:w="120" w:type="dxa"/>
+              <w:right w:w="150" w:type="dxa"/>
+            </w:tcMar>
+          </w:tcPr>
+          <w:p>
+            <w:pPr>
+              <w:pBdr>
+                <w:top w:val="nil"/>
+                <w:left w:val="nil"/>
+                <w:bottom w:val="nil"/>
+                <w:right w:val="nil"/>
+                <w:between w:val="nil"/>
+              </w:pBdr>
+              <w:spacing w:before="120" w:after="120"/>
+              <w:jc w:val="center"/>
+              <w:rPr>
+                <w:b/>
+                <w:bCs/>
+                <w:sz w:val="20"/>
+                <w:szCs w:val="20"/>
+              </w:rPr>
+            </w:pPr>
+            <w:r>
+              <w:rPr>
+                <w:b/>
+                <w:bCs/>
+                <w:sz w:val="20"/>
+                <w:szCs w:val="20"/>
+              </w:rPr>
+              <w:t>01</w:t>
+            </w:r>
+          </w:p>
+        </w:tc>
+        <w:tc>
+          <w:tcPr>
+            <w:tcW w:w="6084" w:type="dxa"/>
+            <w:tcBorders>
+              <w:top w:val="single" w:sz="6" w:space="0" w:color="CCCCCC"/>
+              <w:left w:val="single" w:sz="6" w:space="0" w:color="CCCCCC"/>
+              <w:bottom w:val="single" w:sz="6" w:space="0" w:color="CCCCCC"/>
+              <w:right w:val="single" w:sz="6" w:space="0" w:color="CCCCCC"/>
+            </w:tcBorders>
+            <w:shd w:val="clear" w:color="auto" w:fill="F9F9F9"/>
+            <w:tcMar>
+              <w:top w:w="120" w:type="dxa"/>
+              <w:left w:w="150" w:type="dxa"/>
+              <w:bottom w:w="120" w:type="dxa"/>
+              <w:right w:w="150" w:type="dxa"/>
+            </w:tcMar>
+          </w:tcPr>
+          <w:p>
+            <w:pPr>
+              <w:pBdr>
+                <w:top w:val="nil"/>
+                <w:left w:val="nil"/>
+                <w:bottom w:val="nil"/>
+                <w:right w:val="nil"/>
+                <w:between w:val="nil"/>
+              </w:pBdr>
+              <w:spacing w:before="120" w:after="120"/>
+              <w:rPr>
+                <w:sz w:val="20"/>
+                <w:szCs w:val="20"/>
+              </w:rPr>
+            </w:pPr>
+            <w:r>
+              <w:rPr>
+                <w:b/>
+                <w:bCs/>
+                <w:sz w:val="20"/>
+                <w:szCs w:val="20"/>
+              </w:rPr>
+              <w:t>Mão de obra (Cascata 9 m²): Estruturação, armação, modelagem artística, impermeabilização e pintura (R$ 1.500,00/m²). Dimensionamento: 4,00m x 1,50m x 1,60m (altura).</w:t>
+            </w:r>
+          </w:p>
+        </w:tc>
+        <w:tc>
+          <w:tcPr>
+            <w:tcW w:w="2340" w:type="dxa"/>
+            <w:tcBorders>
+              <w:top w:val="single" w:sz="6" w:space="0" w:color="CCCCCC"/>
+              <w:left w:val="single" w:sz="6" w:space="0" w:color="CCCCCC"/>
+              <w:bottom w:val="single" w:sz="6" w:space="0" w:color="CCCCCC"/>
+              <w:right w:val="single" w:sz="6" w:space="0" w:color="CCCCCC"/>
+            </w:tcBorders>
+            <w:shd w:val="clear" w:color="auto" w:fill="F9F9F9"/>
+            <w:tcMar>
+              <w:top w:w="120" w:type="dxa"/>
+              <w:left w:w="150" w:type="dxa"/>
+              <w:bottom w:w="120" w:type="dxa"/>
+              <w:right w:w="150" w:type="dxa"/>
+            </w:tcMar>
+          </w:tcPr>
+          <w:p>
+            <w:pPr>
+              <w:pBdr>
+                <w:top w:val="nil"/>
+                <w:left w:val="nil"/>
+                <w:bottom w:val="nil"/>
+                <w:right w:val="nil"/>
+                <w:between w:val="nil"/>
+              </w:pBdr>
+              <w:spacing w:before="120" w:after="120"/>
+              <w:jc w:val="right"/>
+              <w:rPr>
+                <w:sz w:val="20"/>
+                <w:szCs w:val="20"/>
+              </w:rPr>
+            </w:pPr>
+            <w:r>
+              <w:rPr>
+                <w:sz w:val="20"/>
+                <w:szCs w:val="20"/>
+              </w:rPr>
+              <w:t>R$ {valorCascata}</w:t>
+            </w:r>
+          </w:p>
+        </w:tc>
+      </w:tr>
+      <w:tr>
+        <w:tc>
+          <w:tcPr>
+            <w:tcW w:w="936" w:type="dxa"/>
+            <w:tcBorders>
+              <w:top w:val="single" w:sz="6" w:space="0" w:color="CCCCCC"/>
+              <w:left w:val="single" w:sz="6" w:space="0" w:color="CCCCCC"/>
+              <w:bottom w:val="single" w:sz="6" w:space="0" w:color="CCCCCC"/>
+              <w:right w:val="single" w:sz="6" w:space="0" w:color="CCCCCC"/>
+            </w:tcBorders>
+            <w:tcMar>
+              <w:top w:w="120" w:type="dxa"/>
+              <w:left w:w="150" w:type="dxa"/>
+              <w:bottom w:w="120" w:type="dxa"/>
+              <w:right w:w="150" w:type="dxa"/>
+            </w:tcMar>
+          </w:tcPr>
+          <w:p>
+            <w:pPr>
+              <w:pBdr>
+                <w:top w:val="nil"/>
+                <w:left w:val="nil"/>
+                <w:bottom w:val="nil"/>
+                <w:right w:val="nil"/>
+                <w:between w:val="nil"/>
+              </w:pBdr>
+              <w:spacing w:before="120" w:after="120"/>
+              <w:jc w:val="center"/>
+              <w:rPr>
+                <w:b/>
+                <w:bCs/>
+                <w:sz w:val="20"/>
+                <w:szCs w:val="20"/>
+              </w:rPr>
+            </w:pPr>
+            <w:r>
+              <w:rPr>
+                <w:b/>
+                <w:bCs/>
+                <w:sz w:val="20"/>
+                <w:szCs w:val="20"/>
+              </w:rPr>
+              <w:t>02</w:t>
+            </w:r>
+          </w:p>
+        </w:tc>
+        <w:tc>
+          <w:tcPr>
+            <w:tcW w:w="6084" w:type="dxa"/>
+            <w:tcBorders>
+              <w:top w:val="single" w:sz="6" w:space="0" w:color="CCCCCC"/>
+              <w:left w:val="single" w:sz="6" w:space="0" w:color="CCCCCC"/>
+              <w:bottom w:val="single" w:sz="6" w:space="0" w:color="CCCCCC"/>
+              <w:right w:val="single" w:sz="6" w:space="0" w:color="CCCCCC"/>
+            </w:tcBorders>
+            <w:tcMar>
+              <w:top w:w="120" w:type="dxa"/>
+              <w:left w:w="150" w:type="dxa"/>
+              <w:bottom w:w="120" w:type="dxa"/>
+              <w:right w:w="150" w:type="dxa"/>
+            </w:tcMar>
+          </w:tcPr>
+          <w:p>
+            <w:pPr>
+              <w:pBdr>
+                <w:top w:val="nil"/>
+                <w:left w:val="nil"/>
+                <w:bottom w:val="nil"/>
+                <w:right w:val="nil"/>
+                <w:between w:val="nil"/>
+              </w:pBdr>
+              <w:spacing w:before="120" w:after="120"/>
+              <w:rPr>
+                <w:sz w:val="20"/>
+                <w:szCs w:val="20"/>
+              </w:rPr>
+            </w:pPr>
+            <w:r>
+              <w:rPr>
+                <w:b/>
+                <w:bCs/>
+                <w:sz w:val="20"/>
+                <w:szCs w:val="20"/>
+              </w:rPr>
+              <w:t>Mão de obra (Amontoado de Pedras 6 m²): Estruturação, armação, modelagem artística, impermeabilização e pintura das rochas decorativas. Dimensionamento: 2,00m x 1,50m x 1,00m (altura).</w:t>
+            </w:r>
+          </w:p>
+        </w:tc>
+        <w:tc>
+          <w:tcPr>
+            <w:tcW w:w="2340" w:type="dxa"/>
+            <w:tcBorders>
+              <w:top w:val="single" w:sz="6" w:space="0" w:color="CCCCCC"/>
+              <w:left w:val="single" w:sz="6" w:space="0" w:color="CCCCCC"/>
+              <w:bottom w:val="single" w:sz="6" w:space="0" w:color="CCCCCC"/>
+              <w:right w:val="single" w:sz="6" w:space="0" w:color="CCCCCC"/>
+            </w:tcBorders>
+            <w:tcMar>
+              <w:top w:w="120" w:type="dxa"/>
+              <w:left w:w="150" w:type="dxa"/>
+              <w:bottom w:w="120" w:type="dxa"/>
+              <w:right w:w="150" w:type="dxa"/>
+            </w:tcMar>
+          </w:tcPr>
+          <w:p>
+            <w:pPr>
+              <w:pBdr>
+                <w:top w:val="nil"/>
+                <w:left w:val="nil"/>
+                <w:bottom w:val="nil"/>
+                <w:right w:val="nil"/>
+                <w:between w:val="nil"/>
+              </w:pBdr>
+              <w:spacing w:before="120" w:after="120"/>
+              <w:jc w:val="right"/>
+              <w:rPr>
+                <w:sz w:val="20"/>
+                <w:szCs w:val="20"/>
+              </w:rPr>
+            </w:pPr>
+            <w:r>
+              <w:rPr>
+                <w:sz w:val="20"/>
+                <w:szCs w:val="20"/>
+              </w:rPr>
+              <w:t>R$ {valorPedras}</w:t>
+            </w:r>
+          </w:p>
+        </w:tc>
+      </w:tr>
+      <w:tr>
+        <w:tc>
+          <w:tcPr>
+            <w:tcW w:w="936" w:type="dxa"/>
+            <w:tcBorders>
+              <w:top w:val="single" w:sz="6" w:space="0" w:color="CCCCCC"/>
+              <w:left w:val="single" w:sz="6" w:space="0" w:color="CCCCCC"/>
+              <w:bottom w:val="single" w:sz="6" w:space="0" w:color="CCCCCC"/>
+              <w:right w:val="single" w:sz="6" w:space="0" w:color="CCCCCC"/>
+            </w:tcBorders>
+            <w:shd w:val="clear" w:color="auto" w:fill="F9F9F9"/>
+            <w:tcMar>
+              <w:top w:w="120" w:type="dxa"/>
+              <w:left w:w="150" w:type="dxa"/>
+              <w:bottom w:w="120" w:type="dxa"/>
+              <w:right w:w="150" w:type="dxa"/>
+            </w:tcMar>
+          </w:tcPr>
+          <w:p>
+            <w:pPr>
+              <w:pBdr>
+                <w:top w:val="nil"/>
+                <w:left w:val="nil"/>
+                <w:bottom w:val="nil"/>
+                <w:right w:val="nil"/>
+                <w:between w:val="nil"/>
+              </w:pBdr>
+              <w:spacing w:before="120" w:after="120"/>
+              <w:jc w:val="center"/>
+              <w:rPr>
+                <w:b/>
+                <w:bCs/>
+                <w:sz w:val="20"/>
+                <w:szCs w:val="20"/>
+              </w:rPr>
+            </w:pPr>
+            <w:r>
+              <w:rPr>
+                <w:b/>
+                <w:bCs/>
+                <w:sz w:val="20"/>
+                <w:szCs w:val="20"/>
+              </w:rPr>
+              <w:t>03</w:t>
+            </w:r>
+          </w:p>
+        </w:tc>
+        <w:tc>
+          <w:tcPr>
+            <w:tcW w:w="6084" w:type="dxa"/>
+            <w:tcBorders>
+              <w:top w:val="single" w:sz="6" w:space="0" w:color="CCCCCC"/>
+              <w:left w:val="single" w:sz="6" w:space="0" w:color="CCCCCC"/>
+              <w:bottom w:val="single" w:sz="6" w:space="0" w:color="CCCCCC"/>
+              <w:right w:val="single" w:sz="6" w:space="0" w:color="CCCCCC"/>
+            </w:tcBorders>
+            <w:shd w:val="clear" w:color="auto" w:fill="F9F9F9"/>
+            <w:tcMar>
+              <w:top w:w="120" w:type="dxa"/>
+              <w:left w:w="150" w:type="dxa"/>
+              <w:bottom w:w="120" w:type="dxa"/>
+              <w:right w:w="150" w:type="dxa"/>
+            </w:tcMar>
+          </w:tcPr>
+          <w:p>
+            <w:pPr>
+              <w:pBdr>
+                <w:top w:val="nil"/>
+                <w:left w:val="nil"/>
+                <w:bottom w:val="nil"/>
+                <w:right w:val="nil"/>
+                <w:between w:val="nil"/>
+              </w:pBdr>
+              <w:spacing w:before="120" w:after="120"/>
+              <w:rPr>
+                <w:i/>
+                <w:iCs/>
+                <w:sz w:val="20"/>
+                <w:szCs w:val="20"/>
+              </w:rPr>
+            </w:pPr>
+            <w:r>
+              <w:rPr>
+                <w:b/>
+                <w:bCs/>
+                <w:sz w:val="20"/>
+                <w:szCs w:val="20"/>
+              </w:rPr>
+              <w:t>Materiais de Construção: Fornecimento completo de areia, cimento, ferro, tintas especiais, aditivos de alta performance e impermeabilizantes. (Incluso no escopo da contratada)</w:t>
+            </w:r>
+          </w:p>
+        </w:tc>
+        <w:tc>
+          <w:tcPr>
+            <w:tcW w:w="2340" w:type="dxa"/>
+            <w:tcBorders>
+              <w:top w:val="single" w:sz="6" w:space="0" w:color="CCCCCC"/>
+              <w:left w:val="single" w:sz="6" w:space="0" w:color="CCCCCC"/>
+              <w:bottom w:val="single" w:sz="6" w:space="0" w:color="CCCCCC"/>
+              <w:right w:val="single" w:sz="6" w:space="0" w:color="CCCCCC"/>
+            </w:tcBorders>
+            <w:shd w:val="clear" w:color="auto" w:fill="F9F9F9"/>
+            <w:tcMar>
+              <w:top w:w="120" w:type="dxa"/>
+              <w:left w:w="150" w:type="dxa"/>
+              <w:bottom w:w="120" w:type="dxa"/>
+              <w:right w:w="150" w:type="dxa"/>
+            </w:tcMar>
+          </w:tcPr>
+          <w:p>
+            <w:pPr>
+              <w:pBdr>
+                <w:top w:val="nil"/>
+                <w:left w:val="nil"/>
+                <w:bottom w:val="nil"/>
+                <w:right w:val="nil"/>
+                <w:between w:val="nil"/>
+              </w:pBdr>
+              <w:spacing w:before="120" w:after="120"/>
+              <w:jc w:val="right"/>
+              <w:rPr>
+                <w:sz w:val="20"/>
+                <w:szCs w:val="20"/>
+              </w:rPr>
+            </w:pPr>
+            <w:r>
+              <w:rPr>
+                <w:sz w:val="20"/>
+                <w:szCs w:val="20"/>
+              </w:rPr>
+              <w:t>R$ {valorMateriais}</w:t>
+            </w:r>
+          </w:p>
+        </w:tc>
+      </w:tr>
+      <w:tr>
+        <w:tc>
+          <w:tcPr>
+            <w:tcW w:w="936" w:type="dxa"/>
+            <w:tcBorders>
+              <w:top w:val="single" w:sz="6" w:space="0" w:color="CCCCCC"/>
+              <w:left w:val="single" w:sz="6" w:space="0" w:color="CCCCCC"/>
+              <w:bottom w:val="single" w:sz="6" w:space="0" w:color="CCCCCC"/>
+              <w:right w:val="single" w:sz="6" w:space="0" w:color="CCCCCC"/>
+            </w:tcBorders>
+            <w:tcMar>
+              <w:top w:w="120" w:type="dxa"/>
+              <w:left w:w="150" w:type="dxa"/>
+              <w:bottom w:w="120" w:type="dxa"/>
+              <w:right w:w="150" w:type="dxa"/>
+            </w:tcMar>
+          </w:tcPr>
+          <w:p>
+            <w:pPr>
+              <w:pBdr>
+                <w:top w:val="nil"/>
+                <w:left w:val="nil"/>
+                <w:bottom w:val="nil"/>
+                <w:right w:val="nil"/>
+                <w:between w:val="nil"/>
+              </w:pBdr>
+              <w:spacing w:before="120" w:after="120"/>
+              <w:jc w:val="center"/>
+              <w:rPr>
+                <w:b/>
+                <w:bCs/>
+                <w:sz w:val="20"/>
+                <w:szCs w:val="20"/>
+              </w:rPr>
+            </w:pPr>
+            <w:r>
+              <w:rPr>
+                <w:b/>
+                <w:bCs/>
+                <w:sz w:val="20"/>
+                <w:szCs w:val="20"/>
+              </w:rPr>
+              <w:t>04</w:t>
+            </w:r>
+          </w:p>
+        </w:tc>
+        <w:tc>
+          <w:tcPr>
+            <w:tcW w:w="6084" w:type="dxa"/>
+            <w:tcBorders>
+              <w:top w:val="single" w:sz="6" w:space="0" w:color="CCCCCC"/>
+              <w:left w:val="single" w:sz="6" w:space="0" w:color="CCCCCC"/>
+              <w:bottom w:val="single" w:sz="6" w:space="0" w:color="CCCCCC"/>
+              <w:right w:val="single" w:sz="6" w:space="0" w:color="CCCCCC"/>
+            </w:tcBorders>
+            <w:tcMar>
+              <w:top w:w="120" w:type="dxa"/>
+              <w:left w:w="150" w:type="dxa"/>
+              <w:bottom w:w="120" w:type="dxa"/>
+              <w:right w:w="150" w:type="dxa"/>
+            </w:tcMar>
+          </w:tcPr>
+          <w:p>
+            <w:pPr>
+              <w:pBdr>
+                <w:top w:val="nil"/>
+                <w:left w:val="nil"/>
+                <w:bottom w:val="nil"/>
+                <w:right w:val="nil"/>
+                <w:between w:val="nil"/>
+              </w:pBdr>
+              <w:spacing w:before="120" w:after="120"/>
+              <w:rPr>
+                <w:sz w:val="20"/>
+                <w:szCs w:val="20"/>
+              </w:rPr>
+            </w:pPr>
+            <w:r>
+              <w:rPr>
+                <w:b/>
+                <w:bCs/>
+                <w:sz w:val="20"/>
+                <w:szCs w:val="20"/>
+              </w:rPr>
+              <w:t>Transporte e Acomodação: Logística de frete, deslocamento da equipe técnica e hospedagem inclusos na proposta.</w:t>
+            </w:r>
+          </w:p>
+        </w:tc>
+        <w:tc>
+          <w:tcPr>
+            <w:tcW w:w="2340" w:type="dxa"/>
+            <w:tcBorders>
+              <w:top w:val="single" w:sz="6" w:space="0" w:color="CCCCCC"/>
+              <w:left w:val="single" w:sz="6" w:space="0" w:color="CCCCCC"/>
+              <w:bottom w:val="single" w:sz="6" w:space="0" w:color="CCCCCC"/>
+              <w:right w:val="single" w:sz="6" w:space="0" w:color="CCCCCC"/>
+            </w:tcBorders>
+            <w:tcMar>
+              <w:top w:w="120" w:type="dxa"/>
+              <w:left w:w="150" w:type="dxa"/>
+              <w:bottom w:w="120" w:type="dxa"/>
+              <w:right w:w="150" w:type="dxa"/>
+            </w:tcMar>
+          </w:tcPr>
+          <w:p>
+            <w:pPr>
+              <w:pBdr>
+                <w:top w:val="nil"/>
+                <w:left w:val="nil"/>
+                <w:bottom w:val="nil"/>
+                <w:right w:val="nil"/>
+                <w:between w:val="nil"/>
+              </w:pBdr>
+              <w:spacing w:before="120" w:after="120"/>
+              <w:jc w:val="right"/>
+              <w:rPr>
+                <w:sz w:val="20"/>
+                <w:szCs w:val="20"/>
+              </w:rPr>
+            </w:pPr>
+            <w:r>
+              <w:rPr>
+                <w:sz w:val="20"/>
+                <w:szCs w:val="20"/>
+              </w:rPr>
+              <w:t>Incluso</w:t>
+            </w:r>
+          </w:p>
+        </w:tc>
+      </w:tr>
+      <w:tr>
+        <w:tc>
+          <w:tcPr>
+            <w:tcW w:w="7020" w:type="dxa"/>
+            <w:gridSpan w:val="2"/>
+            <w:tcBorders>
+              <w:top w:val="single" w:sz="6" w:space="0" w:color="CCCCCC"/>
+              <w:left w:val="single" w:sz="6" w:space="0" w:color="CCCCCC"/>
+              <w:bottom w:val="single" w:sz="6" w:space="0" w:color="CCCCCC"/>
+              <w:right w:val="single" w:sz="6" w:space="0" w:color="CCCCCC"/>
+            </w:tcBorders>
+            <w:shd w:val="clear" w:color="auto" w:fill="E6F0FA"/>
             <w:tcMar>
               <w:top w:w="150" w:type="dxa"/>
               <w:left w:w="150" w:type="dxa"/>
@@ -860,54 +1435,18 @@
               <w:rPr>
                 <w:b/>
                 <w:bCs/>
+                <w:sz w:val="20"/>
+                <w:szCs w:val="20"/>
               </w:rPr>
             </w:pPr>
             <w:r>
               <w:rPr>
                 <w:b/>
                 <w:bCs/>
+                <w:sz w:val="20"/>
+                <w:szCs w:val="20"/>
               </w:rPr>
-              <w:t>01</w:t>
-            </w:r>
-          </w:p>
-        </w:tc>
-        <w:tc>
-          <w:tcPr>
-            <w:tcW w:w="6084" w:type="dxa"/>
-            <w:tcBorders>
-              <w:top w:val="single" w:sz="6" w:space="0" w:color="CCCCCC"/>
-              <w:left w:val="single" w:sz="6" w:space="0" w:color="CCCCCC"/>
-              <w:bottom w:val="single" w:sz="6" w:space="0" w:color="CCCCCC"/>
-              <w:right w:val="single" w:sz="6" w:space="0" w:color="CCCCCC"/>
-            </w:tcBorders>
-            <w:shd w:val="clear" w:color="auto" w:fill="F9F9F9"/>
-            <w:tcMar>
-              <w:top w:w="150" w:type="dxa"/>
-              <w:left w:w="150" w:type="dxa"/>
-              <w:bottom w:w="150" w:type="dxa"/>
-              <w:right w:w="150" w:type="dxa"/>
-            </w:tcMar>
-          </w:tcPr>
-          <w:p>
-            <w:pPr>
-              <w:pBdr>
-                <w:top w:val="nil"/>
-                <w:left w:val="nil"/>
-                <w:bottom w:val="nil"/>
-                <w:right w:val="nil"/>
-                <w:between w:val="nil"/>
-              </w:pBdr>
-              <w:spacing w:before="150" w:after="150"/>
-            </w:pPr>
-            <w:r>
-              <w:rPr>
-                <w:b/>
-                <w:bCs/>
-              </w:rPr>
-              <w:t>Mão de obra:</w:t>
-            </w:r>
-            <w:r>
-              <w:t xml:space="preserve"> Estruturação, armação, modelagem artística, impermeabilização e pintura.</w:t>
+              <w:t>Investimento Total da Obra (Chave na Mão)</w:t>
             </w:r>
           </w:p>
         </w:tc>
@@ -920,251 +1459,7 @@
               <w:bottom w:val="single" w:sz="6" w:space="0" w:color="CCCCCC"/>
               <w:right w:val="single" w:sz="6" w:space="0" w:color="CCCCCC"/>
             </w:tcBorders>
-            <w:shd w:val="clear" w:color="auto" w:fill="F9F9F9"/>
-            <w:tcMar>
-              <w:top w:w="150" w:type="dxa"/>
-              <w:left w:w="150" w:type="dxa"/>
-              <w:bottom w:w="150" w:type="dxa"/>
-              <w:right w:w="150" w:type="dxa"/>
-            </w:tcMar>
-          </w:tcPr>
-          <w:p>
-            <w:pPr>
-              <w:pBdr>
-                <w:top w:val="nil"/>
-                <w:left w:val="nil"/>
-                <w:bottom w:val="nil"/>
-                <w:right w:val="nil"/>
-                <w:between w:val="nil"/>
-              </w:pBdr>
-              <w:spacing w:before="150" w:after="150"/>
-              <w:jc w:val="right"/>
-            </w:pPr>
-            <w:r>
-              <w:t>R$ {precoUnitario}</w:t>
-            </w:r>
-          </w:p>
-        </w:tc>
-      </w:tr>
-      <w:tr>
-        <w:tc>
-          <w:tcPr>
-            <w:tcW w:w="936" w:type="dxa"/>
-            <w:tcBorders>
-              <w:top w:val="single" w:sz="6" w:space="0" w:color="CCCCCC"/>
-              <w:left w:val="single" w:sz="6" w:space="0" w:color="CCCCCC"/>
-              <w:bottom w:val="single" w:sz="6" w:space="0" w:color="CCCCCC"/>
-              <w:right w:val="single" w:sz="6" w:space="0" w:color="CCCCCC"/>
-            </w:tcBorders>
-            <w:tcMar>
-              <w:top w:w="150" w:type="dxa"/>
-              <w:left w:w="150" w:type="dxa"/>
-              <w:bottom w:w="150" w:type="dxa"/>
-              <w:right w:w="150" w:type="dxa"/>
-            </w:tcMar>
-          </w:tcPr>
-          <w:p>
-            <w:pPr>
-              <w:pBdr>
-                <w:top w:val="nil"/>
-                <w:left w:val="nil"/>
-                <w:bottom w:val="nil"/>
-                <w:right w:val="nil"/>
-                <w:between w:val="nil"/>
-              </w:pBdr>
-              <w:spacing w:before="150" w:after="150"/>
-              <w:jc w:val="center"/>
-              <w:rPr>
-                <w:b/>
-                <w:bCs/>
-              </w:rPr>
-            </w:pPr>
-            <w:r>
-              <w:rPr>
-                <w:b/>
-                <w:bCs/>
-              </w:rPr>
-              <w:t>02</w:t>
-            </w:r>
-          </w:p>
-        </w:tc>
-        <w:tc>
-          <w:tcPr>
-            <w:tcW w:w="6084" w:type="dxa"/>
-            <w:tcBorders>
-              <w:top w:val="single" w:sz="6" w:space="0" w:color="CCCCCC"/>
-              <w:left w:val="single" w:sz="6" w:space="0" w:color="CCCCCC"/>
-              <w:bottom w:val="single" w:sz="6" w:space="0" w:color="CCCCCC"/>
-              <w:right w:val="single" w:sz="6" w:space="0" w:color="CCCCCC"/>
-            </w:tcBorders>
-            <w:tcMar>
-              <w:top w:w="150" w:type="dxa"/>
-              <w:left w:w="150" w:type="dxa"/>
-              <w:bottom w:w="150" w:type="dxa"/>
-              <w:right w:w="150" w:type="dxa"/>
-            </w:tcMar>
-          </w:tcPr>
-          <w:p>
-            <w:pPr>
-              <w:pBdr>
-                <w:top w:val="nil"/>
-                <w:left w:val="nil"/>
-                <w:bottom w:val="nil"/>
-                <w:right w:val="nil"/>
-                <w:between w:val="nil"/>
-              </w:pBdr>
-              <w:spacing w:before="150" w:after="150"/>
-              <w:rPr>
-                <w:i/>
-                <w:iCs/>
-              </w:rPr>
-            </w:pPr>
-            <w:r>
-              <w:rPr>
-                <w:b/>
-                <w:bCs/>
-              </w:rPr>
-              <w:t>Previsão de material:</w:t>
-            </w:r>
-            <w:r>
-              <w:t xml:space="preserve"> Areia, cimento, ferro, tinta, aditivos e impermeabilizantes. </w:t>
-            </w:r>
-            <w:r>
-              <w:rPr>
-                <w:i/>
-                <w:iCs/>
-              </w:rPr>
-              <w:t>(Aquisição por conta do cliente)</w:t>
-            </w:r>
-          </w:p>
-        </w:tc>
-        <w:tc>
-          <w:tcPr>
-            <w:tcW w:w="2340" w:type="dxa"/>
-            <w:tcBorders>
-              <w:top w:val="single" w:sz="6" w:space="0" w:color="CCCCCC"/>
-              <w:left w:val="single" w:sz="6" w:space="0" w:color="CCCCCC"/>
-              <w:bottom w:val="single" w:sz="6" w:space="0" w:color="CCCCCC"/>
-              <w:right w:val="single" w:sz="6" w:space="0" w:color="CCCCCC"/>
-            </w:tcBorders>
-            <w:tcMar>
-              <w:top w:w="150" w:type="dxa"/>
-              <w:left w:w="150" w:type="dxa"/>
-              <w:bottom w:w="150" w:type="dxa"/>
-              <w:right w:w="150" w:type="dxa"/>
-            </w:tcMar>
-          </w:tcPr>
-          <w:p>
-            <w:pPr>
-              <w:pBdr>
-                <w:top w:val="nil"/>
-                <w:left w:val="nil"/>
-                <w:bottom w:val="nil"/>
-                <w:right w:val="nil"/>
-                <w:between w:val="nil"/>
-              </w:pBdr>
-              <w:spacing w:before="150" w:after="150"/>
-              <w:jc w:val="right"/>
-            </w:pPr>
-            <w:r>
-              <w:t>R$ {precoAditivo}</w:t>
-            </w:r>
-          </w:p>
-        </w:tc>
-      </w:tr>
-      <w:tr>
-        <w:tc>
-          <w:tcPr>
-            <w:tcW w:w="936" w:type="dxa"/>
-            <w:tcBorders>
-              <w:top w:val="single" w:sz="6" w:space="0" w:color="CCCCCC"/>
-              <w:left w:val="single" w:sz="6" w:space="0" w:color="CCCCCC"/>
-              <w:bottom w:val="single" w:sz="6" w:space="0" w:color="CCCCCC"/>
-              <w:right w:val="single" w:sz="6" w:space="0" w:color="CCCCCC"/>
-            </w:tcBorders>
-            <w:shd w:val="clear" w:color="auto" w:fill="F9F9F9"/>
-            <w:tcMar>
-              <w:top w:w="150" w:type="dxa"/>
-              <w:left w:w="150" w:type="dxa"/>
-              <w:bottom w:w="150" w:type="dxa"/>
-              <w:right w:w="150" w:type="dxa"/>
-            </w:tcMar>
-          </w:tcPr>
-          <w:p>
-            <w:pPr>
-              <w:pBdr>
-                <w:top w:val="nil"/>
-                <w:left w:val="nil"/>
-                <w:bottom w:val="nil"/>
-                <w:right w:val="nil"/>
-                <w:between w:val="nil"/>
-              </w:pBdr>
-              <w:spacing w:before="150" w:after="150"/>
-              <w:jc w:val="center"/>
-              <w:rPr>
-                <w:b/>
-                <w:bCs/>
-              </w:rPr>
-            </w:pPr>
-            <w:r>
-              <w:rPr>
-                <w:b/>
-                <w:bCs/>
-              </w:rPr>
-              <w:t>03</w:t>
-            </w:r>
-          </w:p>
-        </w:tc>
-        <w:tc>
-          <w:tcPr>
-            <w:tcW w:w="6084" w:type="dxa"/>
-            <w:tcBorders>
-              <w:top w:val="single" w:sz="6" w:space="0" w:color="CCCCCC"/>
-              <w:left w:val="single" w:sz="6" w:space="0" w:color="CCCCCC"/>
-              <w:bottom w:val="single" w:sz="6" w:space="0" w:color="CCCCCC"/>
-              <w:right w:val="single" w:sz="6" w:space="0" w:color="CCCCCC"/>
-            </w:tcBorders>
-            <w:shd w:val="clear" w:color="auto" w:fill="F9F9F9"/>
-            <w:tcMar>
-              <w:top w:w="150" w:type="dxa"/>
-              <w:left w:w="150" w:type="dxa"/>
-              <w:bottom w:w="150" w:type="dxa"/>
-              <w:right w:w="150" w:type="dxa"/>
-            </w:tcMar>
-          </w:tcPr>
-          <w:p>
-            <w:pPr>
-              <w:pBdr>
-                <w:top w:val="nil"/>
-                <w:left w:val="nil"/>
-                <w:bottom w:val="nil"/>
-                <w:right w:val="nil"/>
-                <w:between w:val="nil"/>
-              </w:pBdr>
-              <w:spacing w:before="150" w:after="150"/>
-            </w:pPr>
-            <w:r>
-              <w:rPr>
-                <w:b/>
-                <w:bCs/>
-              </w:rPr>
-              <w:t>Transporte e acomodação:</w:t>
-            </w:r>
-            <w:r>
-              <w:t xml:space="preserve"> Logística e estadia da equipe técnica responsável.</w:t>
-            </w:r>
-          </w:p>
-        </w:tc>
-        <w:tc>
-          <w:tcPr>
-            <w:tcW w:w="2340" w:type="dxa"/>
-            <w:tcBorders>
-              <w:top w:val="single" w:sz="6" w:space="0" w:color="CCCCCC"/>
-              <w:left w:val="single" w:sz="6" w:space="0" w:color="CCCCCC"/>
-              <w:bottom w:val="single" w:sz="6" w:space="0" w:color="CCCCCC"/>
-              <w:right w:val="single" w:sz="6" w:space="0" w:color="CCCCCC"/>
-            </w:tcBorders>
-            <w:shd w:val="clear" w:color="auto" w:fill="F9F9F9"/>
+            <w:shd w:val="clear" w:color="auto" w:fill="E6F0FA"/>
             <w:tcMar>
               <w:top w:w="150" w:type="dxa"/>
               <w:left w:w="150" w:type="dxa"/>
@@ -1186,94 +1481,9 @@
               <w:rPr>
                 <w:b/>
                 <w:bCs/>
-              </w:rPr>
-            </w:pPr>
-            <w:r>
-              <w:rPr>
-                <w:b/>
-                <w:bCs/>
-              </w:rPr>
-              <w:t>Incluso</w:t>
-            </w:r>
-          </w:p>
-        </w:tc>
-      </w:tr>
-      <w:tr>
-        <w:tc>
-          <w:tcPr>
-            <w:tcW w:w="7020" w:type="dxa"/>
-            <w:gridSpan w:val="2"/>
-            <w:tcBorders>
-              <w:top w:val="single" w:sz="6" w:space="0" w:color="CCCCCC"/>
-              <w:left w:val="single" w:sz="6" w:space="0" w:color="CCCCCC"/>
-              <w:bottom w:val="single" w:sz="6" w:space="0" w:color="CCCCCC"/>
-              <w:right w:val="single" w:sz="6" w:space="0" w:color="CCCCCC"/>
-            </w:tcBorders>
-            <w:shd w:val="clear" w:color="auto" w:fill="E6F0FA"/>
-            <w:tcMar>
-              <w:top w:w="180" w:type="dxa"/>
-              <w:left w:w="180" w:type="dxa"/>
-              <w:bottom w:w="180" w:type="dxa"/>
-              <w:right w:w="180" w:type="dxa"/>
-            </w:tcMar>
-          </w:tcPr>
-          <w:p>
-            <w:pPr>
-              <w:pBdr>
-                <w:top w:val="nil"/>
-                <w:left w:val="nil"/>
-                <w:bottom w:val="nil"/>
-                <w:right w:val="nil"/>
-                <w:between w:val="nil"/>
-              </w:pBdr>
-              <w:spacing w:before="180" w:after="180"/>
-              <w:jc w:val="center"/>
-              <w:rPr>
-                <w:b/>
-                <w:bCs/>
-              </w:rPr>
-            </w:pPr>
-            <w:r>
-              <w:rPr>
-                <w:b/>
-                <w:bCs/>
-              </w:rPr>
-              <w:t>Previsão de Investimento Total da Obra</w:t>
-            </w:r>
-          </w:p>
-        </w:tc>
-        <w:tc>
-          <w:tcPr>
-            <w:tcW w:w="2340" w:type="dxa"/>
-            <w:tcBorders>
-              <w:top w:val="single" w:sz="6" w:space="0" w:color="CCCCCC"/>
-              <w:left w:val="single" w:sz="6" w:space="0" w:color="CCCCCC"/>
-              <w:bottom w:val="single" w:sz="6" w:space="0" w:color="CCCCCC"/>
-              <w:right w:val="single" w:sz="6" w:space="0" w:color="CCCCCC"/>
-            </w:tcBorders>
-            <w:shd w:val="clear" w:color="auto" w:fill="E6F0FA"/>
-            <w:tcMar>
-              <w:top w:w="180" w:type="dxa"/>
-              <w:left w:w="180" w:type="dxa"/>
-              <w:bottom w:w="180" w:type="dxa"/>
-              <w:right w:w="180" w:type="dxa"/>
-            </w:tcMar>
-          </w:tcPr>
-          <w:p>
-            <w:pPr>
-              <w:pBdr>
-                <w:top w:val="nil"/>
-                <w:left w:val="nil"/>
-                <w:bottom w:val="nil"/>
-                <w:right w:val="nil"/>
-                <w:between w:val="nil"/>
-              </w:pBdr>
-              <w:spacing w:before="180" w:after="180"/>
-              <w:jc w:val="right"/>
-              <w:rPr>
-                <w:b/>
-                <w:bCs/>
                 <w:color w:val="003366"/>
+                <w:sz w:val="20"/>
+                <w:szCs w:val="20"/>
               </w:rPr>
             </w:pPr>
             <w:r>
@@ -1281,6 +1491,8 @@
                 <w:b/>
                 <w:bCs/>
                 <w:color w:val="003366"/>
+                <w:sz w:val="20"/>
+                <w:szCs w:val="20"/>
               </w:rPr>
               <w:t>R$ {valorTotal}</w:t>
             </w:r>
@@ -1290,6 +1502,25 @@
     </w:tbl>
     <w:p>
       <w:pPr>
+        <w:pStyle w:val="Ttulo2"/>
+        <w:spacing w:before="300" w:after="120"/>
+        <w:rPr>
+          <w:color w:val="003366"/>
+          <w:sz w:val="28"/>
+          <w:szCs w:val="28"/>
+        </w:rPr>
+      </w:pPr>
+      <w:r>
+        <w:rPr>
+          <w:color w:val="003366"/>
+          <w:sz w:val="28"/>
+          <w:szCs w:val="28"/>
+        </w:rPr>
+        <w:t>5. Condições de Pagamento</w:t>
+      </w:r>
+    </w:p>
+    <w:p>
+      <w:pPr>
         <w:pBdr>
           <w:top w:val="nil"/>
           <w:left w:val="nil"/>
@@ -1297,64 +1528,10 @@
           <w:right w:val="nil"/>
           <w:between w:val="nil"/>
         </w:pBdr>
-        <w:spacing w:before="225" w:after="375" w:line="300" w:lineRule="auto"/>
-        <w:rPr>
-          <w:i/>
-          <w:iCs/>
-          <w:color w:val="555555"/>
-          <w:sz w:val="18"/>
-          <w:szCs w:val="18"/>
-        </w:rPr>
+        <w:spacing w:after="150" w:line="275" w:lineRule="auto"/>
       </w:pPr>
       <w:r>
-        <w:rPr>
-          <w:i/>
-          <w:iCs/>
-          <w:color w:val="555555"/>
-          <w:sz w:val="18"/>
-          <w:szCs w:val="18"/>
-        </w:rPr>
-        <w:t>Nota: O valor a ser contratado diretamente junto à ECO STONE BRASIL é de R$ {precoUnitario}, referente aos itens 01 e 03.</w:t>
-      </w:r>
-    </w:p>
-    <w:p>
-      <w:pPr>
-        <w:pStyle w:val="Ttulo2"/>
-        <w:spacing w:before="0" w:after="150"/>
-        <w:rPr>
-          <w:color w:val="003366"/>
-        </w:rPr>
-      </w:pPr>
-      <w:r>
-        <w:rPr>
-          <w:color w:val="003366"/>
-        </w:rPr>
-        <w:t>5. Condições de Pagamento (Referente ao Item 01)</w:t>
-      </w:r>
-    </w:p>
-    <w:p>
-      <w:pPr>
-        <w:pBdr>
-          <w:top w:val="nil"/>
-          <w:left w:val="nil"/>
-          <w:bottom w:val="nil"/>
-          <w:right w:val="nil"/>
-          <w:between w:val="nil"/>
-        </w:pBdr>
-        <w:spacing w:after="225" w:line="300" w:lineRule="auto"/>
-      </w:pPr>
-      <w:r>
-        <w:t xml:space="preserve">O valor de </w:t>
-      </w:r>
-      <w:r>
-        <w:rPr>
-          <w:b/>
-          <w:bCs/>
-        </w:rPr>
-        <w:t>R$ {precoUnitario}</w:t>
-      </w:r>
-      <w:r>
-        <w:t xml:space="preserve"> referente ao fornecimento da mão de obra especializada, logística e estadia da ECO STONE BRASIL será parcelado da seguinte forma:</w:t>
+        <w:t xml:space="preserve">O valor contratual de R$ {valorTotal} referente ao fornecimento da mão de obra, materiais, logística e estadia da ECO STONE BRASIL será parcelado da seguinte forma:</w:t>
       </w:r>
     </w:p>
     <w:p>
@@ -1370,17 +1547,14 @@
           <w:right w:val="nil"/>
           <w:between w:val="nil"/>
         </w:pBdr>
-        <w:spacing w:line="300" w:lineRule="auto"/>
+        <w:spacing w:line="275" w:lineRule="auto"/>
       </w:pPr>
       <w:r>
         <w:rPr>
           <w:b/>
           <w:bCs/>
         </w:rPr>
-        <w:t>1ª Parcela (50% - R$ {valorEntrada}):</w:t>
-      </w:r>
-      <w:r>
-        <w:t xml:space="preserve"> Paga no ato de aprovação e aceite desta proposta (Entrada).</w:t>
+        <w:t>1ª Parcela (50% - R$ {valorEntrada}): Paga como sinal de Entrada, no ato de aprovação e assinatura desta proposta.</w:t>
       </w:r>
     </w:p>
     <w:p>
@@ -1396,17 +1570,14 @@
           <w:right w:val="nil"/>
           <w:between w:val="nil"/>
         </w:pBdr>
-        <w:spacing w:line="300" w:lineRule="auto"/>
+        <w:spacing w:line="275" w:lineRule="auto"/>
       </w:pPr>
       <w:r>
         <w:rPr>
           <w:b/>
           <w:bCs/>
         </w:rPr>
-        <w:t>2ª Parcela (30% - R$ {valorIntermediaria}):</w:t>
-      </w:r>
-      <w:r>
-        <w:t xml:space="preserve"> Paga após a conclusão da etapa de impermeabilização das pedras/rochas esculpidas.</w:t>
+        <w:t>2ª Parcela (30% - R$ {valorIntermediaria}): Paga imediatamente após a conclusão da impermeabilização das pedras e rochas esculpidas.</w:t>
       </w:r>
     </w:p>
     <w:p>
@@ -1422,32 +1593,32 @@
           <w:right w:val="nil"/>
           <w:between w:val="nil"/>
         </w:pBdr>
-        <w:spacing w:after="120" w:line="300" w:lineRule="auto"/>
+        <w:spacing w:after="90" w:line="275" w:lineRule="auto"/>
       </w:pPr>
       <w:r>
         <w:rPr>
           <w:b/>
           <w:bCs/>
         </w:rPr>
-        <w:t>3ª Parcela (20% - R$ {valorFinal}):</w:t>
-      </w:r>
-      <w:r>
-        <w:t xml:space="preserve"> Paga na finalização dos testes técnicos e assinatura do Termo de Entrega da obra.</w:t>
+        <w:t>3ª Parcela (20% - R$ {valorFinal}): Paga na finalização dos testes técnicos e assinatura do Termo de Entrega da obra.</w:t>
       </w:r>
     </w:p>
     <w:p>
       <w:pPr>
         <w:pStyle w:val="Ttulo2"/>
-        <w:spacing w:before="375" w:after="150"/>
+        <w:spacing w:before="300" w:after="120"/>
         <w:rPr>
           <w:color w:val="003366"/>
+          <w:sz w:val="28"/>
+          <w:szCs w:val="28"/>
         </w:rPr>
       </w:pPr>
       <w:r>
         <w:rPr>
           <w:color w:val="003366"/>
+          <w:sz w:val="28"/>
+          <w:szCs w:val="28"/>
         </w:rPr>
-        <w:lastRenderedPageBreak/>
         <w:t>6. Prazos e Garantias</w:t>
       </w:r>
     </w:p>
@@ -1464,27 +1635,15 @@
           <w:right w:val="nil"/>
           <w:between w:val="nil"/>
         </w:pBdr>
-        <w:spacing w:line="300" w:lineRule="auto"/>
+        <w:spacing w:line="275" w:lineRule="auto"/>
       </w:pPr>
       <w:r>
         <w:rPr>
           <w:b/>
           <w:bCs/>
         </w:rPr>
-        <w:t>Prazo de Execução:</w:t>
-      </w:r>
-      <w:r>
-        <w:t xml:space="preserve"> </w:t>
-      </w:r>
-      <w:r>
-        <w:rPr>
-          <w:b/>
-          <w:bCs/>
-        </w:rPr>
-        <w:t>10 dias</w:t>
-      </w:r>
-      <w:r>
-        <w:t xml:space="preserve"> a partir da chegada dos materiais e liberação da área.</w:t>
+        <w:lastRenderedPageBreak/>
+        <w:t>Prazo de Execução: 10 dias a partir da chegada de todos os materiais na obra e liberação da área para o início dos trabalhos.</w:t>
       </w:r>
     </w:p>
     <w:p>
@@ -1500,40 +1659,31 @@
           <w:right w:val="nil"/>
           <w:between w:val="nil"/>
         </w:pBdr>
-        <w:spacing w:after="120" w:line="300" w:lineRule="auto"/>
+        <w:spacing w:after="90" w:line="275" w:lineRule="auto"/>
       </w:pPr>
       <w:r>
         <w:rPr>
           <w:b/>
           <w:bCs/>
         </w:rPr>
-        <w:t>Garantia Estrutural e de Impermeabilização:</w:t>
-      </w:r>
-      <w:r>
-        <w:t xml:space="preserve"> </w:t>
-      </w:r>
-      <w:r>
-        <w:rPr>
-          <w:b/>
-          <w:bCs/>
-        </w:rPr>
-        <w:t>5 anos</w:t>
-      </w:r>
-      <w:r>
-        <w:t xml:space="preserve"> contra defeitos na estrutura executada pela ECO STONE BRASIL.</w:t>
+        <w:t>Garantia: 5 anos contra falhas ou vazamentos na estrutura e impermeabilização realizadas pela ECO STONE BRASIL.</w:t>
       </w:r>
     </w:p>
     <w:p>
       <w:pPr>
         <w:pStyle w:val="Ttulo2"/>
-        <w:spacing w:before="375" w:after="150"/>
+        <w:spacing w:before="300" w:after="120"/>
         <w:rPr>
           <w:color w:val="003366"/>
+          <w:sz w:val="28"/>
+          <w:szCs w:val="28"/>
         </w:rPr>
       </w:pPr>
       <w:r>
         <w:rPr>
           <w:color w:val="003366"/>
+          <w:sz w:val="28"/>
+          <w:szCs w:val="28"/>
         </w:rPr>
         <w:t>7. Aprovação e De acordo</w:t>
       </w:r>
@@ -1547,7 +1697,7 @@
           <w:right w:val="nil"/>
           <w:between w:val="nil"/>
         </w:pBdr>
-        <w:spacing w:after="600" w:line="300" w:lineRule="auto"/>
+        <w:spacing w:after="450" w:line="275" w:lineRule="auto"/>
       </w:pPr>
       <w:r>
         <w:t>Declaramos estar de acordo com as especificações técnicas, escopo de trabalho e valores constantes nesta proposta.</w:t>
@@ -1562,17 +1712,14 @@
           <w:right w:val="nil"/>
           <w:between w:val="nil"/>
         </w:pBdr>
-        <w:spacing w:after="750" w:line="300" w:lineRule="auto"/>
+        <w:spacing w:after="600" w:line="275" w:lineRule="auto"/>
       </w:pPr>
       <w:r>
         <w:rPr>
           <w:b/>
           <w:bCs/>
         </w:rPr>
-        <w:t>{clienteEndereco}</w:t>
-      </w:r>
-      <w:r>
-        <w:t xml:space="preserve">, {dataProposta}</w:t>
+        <w:t>{clienteEndereco}, {dataProposta}.</w:t>
       </w:r>
     </w:p>
     <w:tbl>
@@ -1596,7 +1743,7 @@
               <w:top w:val="single" w:sz="6" w:space="0" w:color="333333"/>
             </w:tcBorders>
             <w:tcMar>
-              <w:top w:w="150" w:type="dxa"/>
+              <w:top w:w="120" w:type="dxa"/>
               <w:left w:w="0" w:type="dxa"/>
               <w:bottom w:w="0" w:type="dxa"/>
               <w:right w:w="0" w:type="dxa"/>
@@ -1634,7 +1781,7 @@
                 <w:right w:val="nil"/>
                 <w:between w:val="nil"/>
               </w:pBdr>
-              <w:spacing w:before="150"/>
+              <w:spacing w:before="120"/>
               <w:jc w:val="center"/>
             </w:pPr>
             <w:r>
@@ -1672,7 +1819,7 @@
               <w:top w:val="single" w:sz="6" w:space="0" w:color="333333"/>
             </w:tcBorders>
             <w:tcMar>
-              <w:top w:w="150" w:type="dxa"/>
+              <w:top w:w="120" w:type="dxa"/>
               <w:left w:w="0" w:type="dxa"/>
               <w:bottom w:w="0" w:type="dxa"/>
               <w:right w:w="0" w:type="dxa"/>
@@ -1710,7 +1857,7 @@
                 <w:right w:val="nil"/>
                 <w:between w:val="nil"/>
               </w:pBdr>
-              <w:spacing w:before="150"/>
+              <w:spacing w:before="120"/>
               <w:jc w:val="center"/>
             </w:pPr>
             <w:r>
@@ -1826,7 +1973,7 @@
       <w:rPr>
         <w:noProof/>
       </w:rPr>
-      <w:pict w14:anchorId="4B18B67A">
+      <w:pict w14:anchorId="49D058A8">
         <v:shapetype id="_x0000_t75" coordsize="21600,21600" o:spt="75" o:preferrelative="t" path="m@4@5l@4@11@9@11@9@5xe" filled="f" stroked="f">
           <v:stroke joinstyle="miter"/>
           <v:formulas>
@@ -1846,7 +1993,7 @@
           <v:path o:extrusionok="f" gradientshapeok="t" o:connecttype="rect"/>
           <o:lock v:ext="edit" aspectratio="t"/>
         </v:shapetype>
-        <v:shape id="WordPictureWatermark351314969" o:spid="_x0000_s1036" type="#_x0000_t75" style="position:absolute;margin-left:0;margin-top:0;width:235.1pt;height:235.1pt;z-index:-251657216;mso-position-horizontal:center;mso-position-horizontal-relative:margin;mso-position-vertical:center;mso-position-vertical-relative:margin" o:allowincell="f">
+        <v:shape id="WordPictureWatermark524105204" o:spid="_x0000_s1026" type="#_x0000_t75" style="position:absolute;margin-left:0;margin-top:0;width:235.1pt;height:235.1pt;z-index:-251657216;mso-position-horizontal:center;mso-position-horizontal-relative:margin;mso-position-vertical:center;mso-position-vertical-relative:margin" o:allowincell="f">
           <v:imagedata r:id="rId1" o:title="WhatsApp Image 2026-07-14 at 11.37.12" gain="19661f" blacklevel="22938f"/>
         </v:shape>
       </w:pict>
@@ -1865,7 +2012,7 @@
       <w:rPr>
         <w:noProof/>
       </w:rPr>
-      <w:pict w14:anchorId="15A5DA60">
+      <w:pict w14:anchorId="0CB7086F">
         <v:shapetype id="_x0000_t75" coordsize="21600,21600" o:spt="75" o:preferrelative="t" path="m@4@5l@4@11@9@11@9@5xe" filled="f" stroked="f">
           <v:stroke joinstyle="miter"/>
           <v:formulas>
@@ -1885,7 +2032,7 @@
           <v:path o:extrusionok="f" gradientshapeok="t" o:connecttype="rect"/>
           <o:lock v:ext="edit" aspectratio="t"/>
         </v:shapetype>
-        <v:shape id="WordPictureWatermark351314970" o:spid="_x0000_s1037" type="#_x0000_t75" style="position:absolute;margin-left:0;margin-top:0;width:235.1pt;height:235.1pt;z-index:-251656192;mso-position-horizontal:center;mso-position-horizontal-relative:margin;mso-position-vertical:center;mso-position-vertical-relative:margin" o:allowincell="f">
+        <v:shape id="WordPictureWatermark524105205" o:spid="_x0000_s1027" type="#_x0000_t75" style="position:absolute;margin-left:0;margin-top:0;width:235.1pt;height:235.1pt;z-index:-251656192;mso-position-horizontal:center;mso-position-horizontal-relative:margin;mso-position-vertical:center;mso-position-vertical-relative:margin" o:allowincell="f">
           <v:imagedata r:id="rId1" o:title="WhatsApp Image 2026-07-14 at 11.37.12" gain="19661f" blacklevel="22938f"/>
         </v:shape>
       </w:pict>
@@ -1904,7 +2051,7 @@
       <w:rPr>
         <w:noProof/>
       </w:rPr>
-      <w:pict w14:anchorId="3C42BF10">
+      <w:pict w14:anchorId="7113A302">
         <v:shapetype id="_x0000_t75" coordsize="21600,21600" o:spt="75" o:preferrelative="t" path="m@4@5l@4@11@9@11@9@5xe" filled="f" stroked="f">
           <v:stroke joinstyle="miter"/>
           <v:formulas>
@@ -1924,7 +2071,7 @@
           <v:path o:extrusionok="f" gradientshapeok="t" o:connecttype="rect"/>
           <o:lock v:ext="edit" aspectratio="t"/>
         </v:shapetype>
-        <v:shape id="WordPictureWatermark351314968" o:spid="_x0000_s1035" type="#_x0000_t75" style="position:absolute;margin-left:0;margin-top:0;width:235.1pt;height:235.1pt;z-index:-251658240;mso-position-horizontal:center;mso-position-horizontal-relative:margin;mso-position-vertical:center;mso-position-vertical-relative:margin" o:allowincell="f">
+        <v:shape id="WordPictureWatermark524105203" o:spid="_x0000_s1025" type="#_x0000_t75" style="position:absolute;margin-left:0;margin-top:0;width:235.1pt;height:235.1pt;z-index:-251658240;mso-position-horizontal:center;mso-position-horizontal-relative:margin;mso-position-vertical:center;mso-position-vertical-relative:margin" o:allowincell="f">
           <v:imagedata r:id="rId1" o:title="WhatsApp Image 2026-07-14 at 11.37.12" gain="19661f" blacklevel="22938f"/>
         </v:shape>
       </w:pict>
@@ -1936,9 +2083,9 @@
 <file path=word/numbering.xml><?xml version="1.0" encoding="utf-8"?>
 <w:numbering xmlns:wpc="http://schemas.microsoft.com/office/word/2010/wordprocessingCanvas" xmlns:cx="http://schemas.microsoft.com/office/drawing/2014/chartex" xmlns:cx1="http://schemas.microsoft.com/office/drawing/2015/9/8/chartex" xmlns:cx2="http://schemas.microsoft.com/office/drawing/2015/10/21/chartex" xmlns:cx3="http://schemas.microsoft.com/office/drawing/2016/5/9/chartex" xmlns:cx4="http://schemas.microsoft.com/office/drawing/2016/5/10/chartex" xmlns:cx5="http://schemas.microsoft.com/office/drawing/2016/5/11/chartex" xmlns:cx6="http://schemas.microsoft.com/office/drawing/2016/5/12/chartex" xmlns:cx7="http://schemas.microsoft.com/office/drawing/2016/5/13/chartex" xmlns:cx8="http://schemas.microsoft.com/office/drawing/2016/5/14/chartex" xmlns:mc="http://schemas.openxmlformats.org/markup-compatibility/2006" xmlns:aink="http://schemas.microsoft.com/office/drawing/2016/ink" xmlns:am3d="http://schemas.microsoft.com/office/drawing/2017/model3d" xmlns:o="urn:schemas-microsoft-com:office:office" xmlns:oel="http://schemas.microsoft.com/office/2019/extlst" xmlns:r="http://schemas.openxmlformats.org/officeDocument/2006/relationships" xmlns:m="http://schemas.openxmlformats.org/officeDocument/2006/math" xmlns:v="urn:schemas-microsoft-com:vml" xmlns:wp14="http://schemas.microsoft.com/office/word/2010/wordprocessingDrawing" xmlns:wp="http://schemas.openxmlformats.org/drawingml/2006/wordprocessingDrawing" xmlns:w10="urn:schemas-microsoft-com:office:word" xmlns:w="http://schemas.openxmlformats.org/wordprocessingml/2006/main" xmlns:w14="http://schemas.microsoft.com/office/word/2010/wordml" xmlns:w15="http://schemas.microsoft.com/office/word/2012/wordml" xmlns:w16cex="http://schemas.microsoft.com/office/word/2018/wordml/cex" xmlns:w16cid="http://schemas.microsoft.com/office/word/2016/wordml/cid" xmlns:w16="http://schemas.microsoft.com/office/word/2018/wordml" xmlns:w16du="http://schemas.microsoft.com/office/word/2023/wordml/word16du" xmlns:w16sdtdh="http://schemas.microsoft.com/office/word/2020/wordml/sdtdatahash" xmlns:w16sdtfl="http://schemas.microsoft.com/office/word/2024/wordml/sdtformatlock" xmlns:w16se="http://schemas.microsoft.com/office/word/2015/wordml/symex" xmlns:wpg="http://schemas.microsoft.com/office/word/2010/wordprocessingGroup" xmlns:wpi="http://schemas.microsoft.com/office/word/2010/wordprocessingInk" xmlns:wne="http://schemas.microsoft.com/office/word/2006/wordml" xmlns:wps="http://schemas.microsoft.com/office/word/2010/wordprocessingShape" mc:Ignorable="w14 w15 w16se w16cid w16 w16cex w16sdtdh w16sdtfl w16du wp14">
   <w:abstractNum w:abstractNumId="0" w15:restartNumberingAfterBreak="0">
-    <w:nsid w:val="06D37C71"/>
+    <w:nsid w:val="18900346"/>
     <w:multiLevelType w:val="multilevel"/>
-    <w:tmpl w:val="A36E2BEE"/>
+    <w:tmpl w:val="9D183612"/>
     <w:lvl w:ilvl="0">
       <w:start w:val="1"/>
       <w:numFmt w:val="bullet"/>
@@ -2157,9 +2304,9 @@
     </w:lvl>
   </w:abstractNum>
   <w:abstractNum w:abstractNumId="1" w15:restartNumberingAfterBreak="0">
-    <w:nsid w:val="15DB2C61"/>
+    <w:nsid w:val="1A4049AE"/>
     <w:multiLevelType w:val="multilevel"/>
-    <w:tmpl w:val="A3E4EB70"/>
+    <w:tmpl w:val="C9241A8E"/>
     <w:lvl w:ilvl="0">
       <w:start w:val="1"/>
       <w:numFmt w:val="bullet"/>
@@ -2378,9 +2525,9 @@
     </w:lvl>
   </w:abstractNum>
   <w:abstractNum w:abstractNumId="2" w15:restartNumberingAfterBreak="0">
-    <w:nsid w:val="1CC0236F"/>
+    <w:nsid w:val="1A7C2EB5"/>
     <w:multiLevelType w:val="multilevel"/>
-    <w:tmpl w:val="240AE584"/>
+    <w:tmpl w:val="443AE860"/>
     <w:lvl w:ilvl="0">
       <w:start w:val="1"/>
       <w:numFmt w:val="bullet"/>
@@ -2599,9 +2746,9 @@
     </w:lvl>
   </w:abstractNum>
   <w:abstractNum w:abstractNumId="3" w15:restartNumberingAfterBreak="0">
-    <w:nsid w:val="431547AC"/>
+    <w:nsid w:val="1F9C6795"/>
     <w:multiLevelType w:val="multilevel"/>
-    <w:tmpl w:val="A3987622"/>
+    <w:tmpl w:val="016E2962"/>
     <w:lvl w:ilvl="0">
       <w:start w:val="1"/>
       <w:numFmt w:val="bullet"/>
@@ -2820,9 +2967,9 @@
     </w:lvl>
   </w:abstractNum>
   <w:abstractNum w:abstractNumId="4" w15:restartNumberingAfterBreak="0">
-    <w:nsid w:val="50063665"/>
+    <w:nsid w:val="2DEA188B"/>
     <w:multiLevelType w:val="multilevel"/>
-    <w:tmpl w:val="E856E914"/>
+    <w:tmpl w:val="A0D0B25E"/>
     <w:lvl w:ilvl="0">
       <w:start w:val="1"/>
       <w:numFmt w:val="bullet"/>
@@ -3041,9 +3188,9 @@
     </w:lvl>
   </w:abstractNum>
   <w:abstractNum w:abstractNumId="5" w15:restartNumberingAfterBreak="0">
-    <w:nsid w:val="5D5D7C7E"/>
+    <w:nsid w:val="676903ED"/>
     <w:multiLevelType w:val="multilevel"/>
-    <w:tmpl w:val="778E11C4"/>
+    <w:tmpl w:val="8AF07D58"/>
     <w:lvl w:ilvl="0">
       <w:start w:val="1"/>
       <w:numFmt w:val="bullet"/>
@@ -3262,9 +3409,9 @@
     </w:lvl>
   </w:abstractNum>
   <w:abstractNum w:abstractNumId="6" w15:restartNumberingAfterBreak="0">
-    <w:nsid w:val="6008646D"/>
+    <w:nsid w:val="6F706298"/>
     <w:multiLevelType w:val="multilevel"/>
-    <w:tmpl w:val="0716209E"/>
+    <w:tmpl w:val="5FDE5716"/>
     <w:lvl w:ilvl="0">
       <w:start w:val="1"/>
       <w:numFmt w:val="bullet"/>
@@ -3483,9 +3630,9 @@
     </w:lvl>
   </w:abstractNum>
   <w:abstractNum w:abstractNumId="7" w15:restartNumberingAfterBreak="0">
-    <w:nsid w:val="69E84521"/>
+    <w:nsid w:val="7E8D42A0"/>
     <w:multiLevelType w:val="multilevel"/>
-    <w:tmpl w:val="07328B36"/>
+    <w:tmpl w:val="695C8E4E"/>
     <w:lvl w:ilvl="0">
       <w:start w:val="1"/>
       <w:numFmt w:val="bullet"/>
@@ -3703,29 +3850,29 @@
       </w:rPr>
     </w:lvl>
   </w:abstractNum>
-  <w:num w:numId="1" w16cid:durableId="1953201869">
+  <w:num w:numId="1" w16cid:durableId="1050809879">
+    <w:abstractNumId w:val="5"/>
+  </w:num>
+  <w:num w:numId="2" w16cid:durableId="484707251">
+    <w:abstractNumId w:val="1"/>
+  </w:num>
+  <w:num w:numId="3" w16cid:durableId="622469727">
     <w:abstractNumId w:val="7"/>
   </w:num>
-  <w:num w:numId="2" w16cid:durableId="2120105038">
-    <w:abstractNumId w:val="1"/>
+  <w:num w:numId="4" w16cid:durableId="353506334">
+    <w:abstractNumId w:val="4"/>
   </w:num>
-  <w:num w:numId="3" w16cid:durableId="419177143">
+  <w:num w:numId="5" w16cid:durableId="1775245432">
+    <w:abstractNumId w:val="3"/>
+  </w:num>
+  <w:num w:numId="6" w16cid:durableId="330328722">
     <w:abstractNumId w:val="2"/>
   </w:num>
-  <w:num w:numId="4" w16cid:durableId="877821492">
-    <w:abstractNumId w:val="6"/>
-  </w:num>
-  <w:num w:numId="5" w16cid:durableId="1349522291">
-    <w:abstractNumId w:val="5"/>
-  </w:num>
-  <w:num w:numId="6" w16cid:durableId="2022390368">
-    <w:abstractNumId w:val="4"/>
-  </w:num>
-  <w:num w:numId="7" w16cid:durableId="658926385">
+  <w:num w:numId="7" w16cid:durableId="1975334760">
     <w:abstractNumId w:val="0"/>
   </w:num>
-  <w:num w:numId="8" w16cid:durableId="550001744">
-    <w:abstractNumId w:val="3"/>
+  <w:num w:numId="8" w16cid:durableId="609435575">
+    <w:abstractNumId w:val="6"/>
   </w:num>
 </w:numbering>
 </file>
@@ -4377,7 +4524,7 @@
     <w:link w:val="CabealhoChar"/>
     <w:uiPriority w:val="99"/>
     <w:unhideWhenUsed/>
-    <w:rsid w:val="003C634C"/>
+    <w:rsid w:val="00B505ED"/>
     <w:pPr>
       <w:tabs>
         <w:tab w:val="center" w:pos="4252"/>
@@ -4390,7 +4537,7 @@
     <w:basedOn w:val="Fontepargpadro"/>
     <w:link w:val="Cabealho"/>
     <w:uiPriority w:val="99"/>
-    <w:rsid w:val="003C634C"/>
+    <w:rsid w:val="00B505ED"/>
   </w:style>
   <w:style w:type="paragraph" w:styleId="Rodap">
     <w:name w:val="footer"/>
@@ -4398,7 +4545,7 @@
     <w:link w:val="RodapChar"/>
     <w:uiPriority w:val="99"/>
     <w:unhideWhenUsed/>
-    <w:rsid w:val="003C634C"/>
+    <w:rsid w:val="00B505ED"/>
     <w:pPr>
       <w:tabs>
         <w:tab w:val="center" w:pos="4252"/>
@@ -4411,30 +4558,7 @@
     <w:basedOn w:val="Fontepargpadro"/>
     <w:link w:val="Rodap"/>
     <w:uiPriority w:val="99"/>
-    <w:rsid w:val="003C634C"/>
-  </w:style>
-  <w:style w:type="paragraph" w:styleId="SemEspaamento">
-    <w:name w:val="No Spacing"/>
-    <w:link w:val="SemEspaamentoChar"/>
-    <w:uiPriority w:val="1"/>
-    <w:qFormat/>
-    <w:rsid w:val="003C634C"/>
-    <w:pPr>
-      <w:widowControl/>
-    </w:pPr>
-    <w:rPr>
-      <w:rFonts w:asciiTheme="minorHAnsi" w:eastAsiaTheme="minorEastAsia" w:hAnsiTheme="minorHAnsi" w:cstheme="minorBidi"/>
-    </w:rPr>
-  </w:style>
-  <w:style w:type="character" w:customStyle="1" w:styleId="SemEspaamentoChar">
-    <w:name w:val="Sem Espaçamento Char"/>
-    <w:basedOn w:val="Fontepargpadro"/>
-    <w:link w:val="SemEspaamento"/>
-    <w:uiPriority w:val="1"/>
-    <w:rsid w:val="003C634C"/>
-    <w:rPr>
-      <w:rFonts w:asciiTheme="minorHAnsi" w:eastAsiaTheme="minorEastAsia" w:hAnsiTheme="minorHAnsi" w:cstheme="minorBidi"/>
-    </w:rPr>
+    <w:rsid w:val="00B505ED"/>
   </w:style>
 </w:styles>
 </file>

</xml_diff>